<commit_message>
Resume: add agentic BI/PostgreSQL detail, algorithmic complexity, electronics skills
Co-Authored-By: Claude Sonnet 5 <noreply@anthropic.com>
</commit_message>
<xml_diff>
--- a/resume/cover-template.docx
+++ b/resume/cover-template.docx
@@ -52,6 +52,23 @@
           <w:sz w:val="22"/>
           <w:szCs w:val="22"/>
         </w:rPr>
+      </w:r>
+    </w:p>
+    <w:p>
+      <w:pPr>
+        <w:pStyle w:val="Normal"/>
+        <w:rPr>
+          <w:rFonts w:cs="Calibri" w:cstheme="minorHAnsi"/>
+          <w:sz w:val="22"/>
+          <w:szCs w:val="22"/>
+        </w:rPr>
+      </w:pPr>
+      <w:r>
+        <w:rPr>
+          <w:rFonts w:cs="Calibri" w:cstheme="minorHAnsi"/>
+          <w:sz w:val="22"/>
+          <w:szCs w:val="22"/>
+        </w:rPr>
         <w:t>Dear {{COMPANY}} Hiring Team,</w:t>
       </w:r>
     </w:p>
@@ -262,7 +279,7 @@
           <w:sz w:val="22"/>
           <w:szCs w:val="22"/>
         </w:rPr>
-        <w:t>Alejandro Echeverría</w:t>
+        <w:t>Lorem Ipsum</w:t>
       </w:r>
     </w:p>
     <w:p>
@@ -282,7 +299,7 @@
             <w:sz w:val="22"/>
             <w:szCs w:val="22"/>
           </w:rPr>
-          <w:t>nablaservices@outlook.com</w:t>
+          <w:t>lorem@ipsum.example</w:t>
         </w:r>
       </w:hyperlink>
     </w:p>
@@ -303,7 +320,7 @@
             <w:sz w:val="22"/>
             <w:szCs w:val="22"/>
           </w:rPr>
-          <w:t>https://linkedin.com/in/cuete</w:t>
+          <w:t>linkedin.com/in/loremipsum</w:t>
         </w:r>
       </w:hyperlink>
     </w:p>
@@ -325,7 +342,7 @@
             <w:sz w:val="22"/>
             <w:szCs w:val="22"/>
           </w:rPr>
-          <w:t>https://github.com/cuete</w:t>
+          <w:t>github.com/loremipsum</w:t>
         </w:r>
       </w:hyperlink>
     </w:p>
@@ -347,7 +364,7 @@
   <w:docDefaults>
     <w:rPrDefault>
       <w:rPr>
-        <w:rFonts w:ascii="Calibri" w:hAnsi="Calibri" w:eastAsia="Calibri" w:cs="Arial" w:asciiTheme="minorHAnsi" w:cstheme="minorBidi" w:eastAsiaTheme="minorHAnsi" w:hAnsiTheme="minorHAnsi"/>
+        <w:rFonts w:ascii="Calibri" w:hAnsi="Calibri" w:eastAsia="Calibri" w:cs="" w:asciiTheme="minorHAnsi" w:cstheme="minorBidi" w:eastAsiaTheme="minorHAnsi" w:hAnsiTheme="minorHAnsi"/>
         <w:kern w:val="2"/>
         <w:sz w:val="24"/>
         <w:szCs w:val="24"/>
@@ -745,12 +762,13 @@
     <w:rsid w:val="00a432e0"/>
     <w:pPr>
       <w:widowControl/>
+      <w:suppressAutoHyphens w:val="true"/>
       <w:bidi w:val="0"/>
       <w:spacing w:lineRule="auto" w:line="259" w:before="0" w:after="100"/>
       <w:jc w:val="start"/>
     </w:pPr>
     <w:rPr>
-      <w:rFonts w:ascii="Calibri" w:hAnsi="Calibri" w:eastAsia="Calibri" w:cs="Arial" w:asciiTheme="minorHAnsi" w:cstheme="minorBidi" w:eastAsiaTheme="minorHAnsi" w:hAnsiTheme="minorHAnsi"/>
+      <w:rFonts w:ascii="Calibri" w:hAnsi="Calibri" w:eastAsia="Calibri" w:cs="" w:asciiTheme="minorHAnsi" w:cstheme="minorBidi" w:eastAsiaTheme="minorHAnsi" w:hAnsiTheme="minorHAnsi"/>
       <w:color w:val="auto"/>
       <w:kern w:val="2"/>
       <w:sz w:val="24"/>
@@ -845,7 +863,7 @@
       <w:outlineLvl w:val="3"/>
     </w:pPr>
     <w:rPr>
-      <w:rFonts w:eastAsia="" w:cs="Times New Roman" w:cstheme="majorBidi" w:eastAsiaTheme="majorEastAsia"/>
+      <w:rFonts w:eastAsia="" w:cs="" w:cstheme="majorBidi" w:eastAsiaTheme="majorEastAsia"/>
       <w:i/>
       <w:iCs/>
       <w:color w:val="538135"/>
@@ -868,7 +886,7 @@
       <w:outlineLvl w:val="4"/>
     </w:pPr>
     <w:rPr>
-      <w:rFonts w:eastAsia="" w:cs="Times New Roman" w:cstheme="majorBidi" w:eastAsiaTheme="majorEastAsia"/>
+      <w:rFonts w:eastAsia="" w:cs="" w:cstheme="majorBidi" w:eastAsiaTheme="majorEastAsia"/>
       <w:color w:val="538135"/>
     </w:rPr>
   </w:style>
@@ -889,7 +907,7 @@
       <w:outlineLvl w:val="5"/>
     </w:pPr>
     <w:rPr>
-      <w:rFonts w:eastAsia="" w:cs="Times New Roman" w:cstheme="majorBidi" w:eastAsiaTheme="majorEastAsia"/>
+      <w:rFonts w:eastAsia="" w:cs="" w:cstheme="majorBidi" w:eastAsiaTheme="majorEastAsia"/>
       <w:i/>
       <w:iCs/>
       <w:color w:themeColor="text1" w:themeTint="a6" w:val="595959"/>
@@ -912,7 +930,7 @@
       <w:outlineLvl w:val="6"/>
     </w:pPr>
     <w:rPr>
-      <w:rFonts w:eastAsia="" w:cs="Times New Roman" w:cstheme="majorBidi" w:eastAsiaTheme="majorEastAsia"/>
+      <w:rFonts w:eastAsia="" w:cs="" w:cstheme="majorBidi" w:eastAsiaTheme="majorEastAsia"/>
       <w:color w:themeColor="text1" w:themeTint="a6" w:val="595959"/>
     </w:rPr>
   </w:style>
@@ -933,7 +951,7 @@
       <w:outlineLvl w:val="7"/>
     </w:pPr>
     <w:rPr>
-      <w:rFonts w:eastAsia="" w:cs="Times New Roman" w:cstheme="majorBidi" w:eastAsiaTheme="majorEastAsia"/>
+      <w:rFonts w:eastAsia="" w:cs="" w:cstheme="majorBidi" w:eastAsiaTheme="majorEastAsia"/>
       <w:i/>
       <w:iCs/>
       <w:color w:themeColor="text1" w:themeTint="d8" w:val="272727"/>
@@ -956,7 +974,7 @@
       <w:outlineLvl w:val="8"/>
     </w:pPr>
     <w:rPr>
-      <w:rFonts w:eastAsia="" w:cs="Times New Roman" w:cstheme="majorBidi" w:eastAsiaTheme="majorEastAsia"/>
+      <w:rFonts w:eastAsia="" w:cs="" w:cstheme="majorBidi" w:eastAsiaTheme="majorEastAsia"/>
       <w:color w:themeColor="text1" w:themeTint="d8" w:val="272727"/>
     </w:rPr>
   </w:style>
@@ -1020,7 +1038,7 @@
     <w:qFormat/>
     <w:rsid w:val="00043f99"/>
     <w:rPr>
-      <w:rFonts w:eastAsia="" w:cs="Times New Roman" w:cstheme="majorBidi" w:eastAsiaTheme="majorEastAsia"/>
+      <w:rFonts w:eastAsia="" w:cs="" w:cstheme="majorBidi" w:eastAsiaTheme="majorEastAsia"/>
       <w:i/>
       <w:iCs/>
       <w:color w:val="538135"/>
@@ -1035,7 +1053,7 @@
     <w:qFormat/>
     <w:rsid w:val="00043f99"/>
     <w:rPr>
-      <w:rFonts w:eastAsia="" w:cs="Times New Roman" w:cstheme="majorBidi" w:eastAsiaTheme="majorEastAsia"/>
+      <w:rFonts w:eastAsia="" w:cs="" w:cstheme="majorBidi" w:eastAsiaTheme="majorEastAsia"/>
       <w:color w:val="538135"/>
     </w:rPr>
   </w:style>
@@ -1048,7 +1066,7 @@
     <w:qFormat/>
     <w:rsid w:val="00043f99"/>
     <w:rPr>
-      <w:rFonts w:eastAsia="" w:cs="Times New Roman" w:cstheme="majorBidi" w:eastAsiaTheme="majorEastAsia"/>
+      <w:rFonts w:eastAsia="" w:cs="" w:cstheme="majorBidi" w:eastAsiaTheme="majorEastAsia"/>
       <w:i/>
       <w:iCs/>
       <w:color w:themeColor="text1" w:themeTint="a6" w:val="595959"/>
@@ -1063,7 +1081,7 @@
     <w:qFormat/>
     <w:rsid w:val="00043f99"/>
     <w:rPr>
-      <w:rFonts w:eastAsia="" w:cs="Times New Roman" w:cstheme="majorBidi" w:eastAsiaTheme="majorEastAsia"/>
+      <w:rFonts w:eastAsia="" w:cs="" w:cstheme="majorBidi" w:eastAsiaTheme="majorEastAsia"/>
       <w:color w:themeColor="text1" w:themeTint="a6" w:val="595959"/>
     </w:rPr>
   </w:style>
@@ -1076,7 +1094,7 @@
     <w:qFormat/>
     <w:rsid w:val="00043f99"/>
     <w:rPr>
-      <w:rFonts w:eastAsia="" w:cs="Times New Roman" w:cstheme="majorBidi" w:eastAsiaTheme="majorEastAsia"/>
+      <w:rFonts w:eastAsia="" w:cs="" w:cstheme="majorBidi" w:eastAsiaTheme="majorEastAsia"/>
       <w:i/>
       <w:iCs/>
       <w:color w:themeColor="text1" w:themeTint="d8" w:val="272727"/>
@@ -1091,7 +1109,7 @@
     <w:qFormat/>
     <w:rsid w:val="00043f99"/>
     <w:rPr>
-      <w:rFonts w:eastAsia="" w:cs="Times New Roman" w:cstheme="majorBidi" w:eastAsiaTheme="majorEastAsia"/>
+      <w:rFonts w:eastAsia="" w:cs="" w:cstheme="majorBidi" w:eastAsiaTheme="majorEastAsia"/>
       <w:color w:themeColor="text1" w:themeTint="d8" w:val="272727"/>
     </w:rPr>
   </w:style>
@@ -1103,7 +1121,7 @@
     <w:qFormat/>
     <w:rsid w:val="00043f99"/>
     <w:rPr>
-      <w:rFonts w:ascii="Calibri Light" w:hAnsi="Calibri Light" w:eastAsia="" w:cs="Times New Roman" w:asciiTheme="majorHAnsi" w:cstheme="majorBidi" w:eastAsiaTheme="majorEastAsia" w:hAnsiTheme="majorHAnsi"/>
+      <w:rFonts w:ascii="Calibri Light" w:hAnsi="Calibri Light" w:eastAsia="" w:cs="" w:asciiTheme="majorHAnsi" w:cstheme="majorBidi" w:eastAsiaTheme="majorEastAsia" w:hAnsiTheme="majorHAnsi"/>
       <w:spacing w:val="-10"/>
       <w:kern w:val="2"/>
       <w:sz w:val="56"/>
@@ -1118,7 +1136,7 @@
     <w:qFormat/>
     <w:rsid w:val="00043f99"/>
     <w:rPr>
-      <w:rFonts w:eastAsia="" w:cs="Times New Roman" w:cstheme="majorBidi" w:eastAsiaTheme="majorEastAsia"/>
+      <w:rFonts w:eastAsia="" w:cs="" w:cstheme="majorBidi" w:eastAsiaTheme="majorEastAsia"/>
       <w:color w:themeColor="text1" w:themeTint="a6" w:val="595959"/>
       <w:spacing w:val="15"/>
       <w:sz w:val="28"/>
@@ -1272,7 +1290,7 @@
       <w:contextualSpacing/>
     </w:pPr>
     <w:rPr>
-      <w:rFonts w:ascii="Calibri Light" w:hAnsi="Calibri Light" w:eastAsia="" w:cs="Times New Roman" w:asciiTheme="majorHAnsi" w:cstheme="majorBidi" w:eastAsiaTheme="majorEastAsia" w:hAnsiTheme="majorHAnsi"/>
+      <w:rFonts w:ascii="Calibri Light" w:hAnsi="Calibri Light" w:eastAsia="" w:cs="" w:asciiTheme="majorHAnsi" w:cstheme="majorBidi" w:eastAsiaTheme="majorEastAsia" w:hAnsiTheme="majorHAnsi"/>
       <w:spacing w:val="-10"/>
       <w:kern w:val="2"/>
       <w:sz w:val="56"/>
@@ -1289,7 +1307,7 @@
     <w:rsid w:val="00043f99"/>
     <w:pPr/>
     <w:rPr>
-      <w:rFonts w:eastAsia="" w:cs="Times New Roman" w:cstheme="majorBidi" w:eastAsiaTheme="majorEastAsia"/>
+      <w:rFonts w:eastAsia="" w:cs="" w:cstheme="majorBidi" w:eastAsiaTheme="majorEastAsia"/>
       <w:color w:themeColor="text1" w:themeTint="a6" w:val="595959"/>
       <w:spacing w:val="15"/>
       <w:sz w:val="28"/>

</xml_diff>